<commit_message>
Project 114 Final Report
</commit_message>
<xml_diff>
--- a/assignments/Template for FSDI-MDI1 Assignments-3 (2).docx
+++ b/assignments/Template for FSDI-MDI1 Assignments-3 (2).docx
@@ -103,6 +103,7 @@
         <w:pStyle w:val="NormalWeb"/>
         <w:rPr>
           <w:rFonts w:ascii="Arial" w:hAnsi="Arial" w:cs="Arial"/>
+          <w:lang w:val="en-US"/>
         </w:rPr>
       </w:pPr>
       <w:r>
@@ -110,6 +111,20 @@
           <w:rFonts w:ascii="Arial" w:hAnsi="Arial" w:cs="Arial"/>
         </w:rPr>
         <w:t>GitHub Repository Link:</w:t>
+      </w:r>
+      <w:r>
+        <w:rPr>
+          <w:rFonts w:ascii="Arial" w:hAnsi="Arial" w:cs="Arial"/>
+          <w:lang w:val="en-US"/>
+        </w:rPr>
+        <w:t xml:space="preserve"> </w:t>
+      </w:r>
+      <w:r>
+        <w:rPr>
+          <w:rFonts w:ascii="Arial" w:hAnsi="Arial" w:cs="Arial"/>
+          <w:lang w:val="en-US"/>
+        </w:rPr>
+        <w:t>https://github.com/SurgthePro/Project-114-Assignments.git</w:t>
       </w:r>
     </w:p>
     <w:p>

</xml_diff>